<commit_message>
initial cluster and vis
</commit_message>
<xml_diff>
--- a/Project Report.docx
+++ b/Project Report.docx
@@ -23,6 +23,17 @@
       </w:r>
     </w:p>
     <w:p/>
+    <w:p/>
+    <w:p>
+      <w:pPr>
+        <w:pStyle w:val="ListParagraph"/>
+        <w:ind w:left="360"/>
+        <w:rPr>
+          <w:b/>
+          <w:bCs/>
+        </w:rPr>
+      </w:pPr>
+    </w:p>
     <w:p>
       <w:pPr>
         <w:pStyle w:val="ListParagraph"/>
@@ -36,15 +47,335 @@
           <w:b/>
           <w:bCs/>
         </w:rPr>
-        <w:t>Data Preprocessing</w:t>
+        <w:t xml:space="preserve">Data </w:t>
+      </w:r>
+      <w:r>
+        <w:rPr>
+          <w:b/>
+          <w:bCs/>
+        </w:rPr>
+        <w:t xml:space="preserve">Exploration and </w:t>
+      </w:r>
+      <w:r>
+        <w:rPr>
+          <w:b/>
+          <w:bCs/>
+        </w:rPr>
+        <w:t>Preprocessing</w:t>
       </w:r>
     </w:p>
     <w:p>
       <w:pPr>
+        <w:ind w:firstLine="360"/>
+        <w:jc w:val="both"/>
+      </w:pPr>
+      <w:r>
+        <w:t xml:space="preserve">The first step in the development of the model is analyzing what data we have and what treatment it needs to be useful to the question in study.  </w:t>
+      </w:r>
+      <w:r>
+        <w:t>Following are some of the key outcomes of that analysis</w:t>
+      </w:r>
+      <w:r>
+        <w:t>:</w:t>
+      </w:r>
+    </w:p>
+    <w:p>
+      <w:pPr>
+        <w:ind w:firstLine="360"/>
+        <w:jc w:val="both"/>
+      </w:pPr>
+      <w:r>
+        <w:t xml:space="preserve">The </w:t>
+      </w:r>
+      <w:r>
+        <w:rPr>
+          <w:b/>
+          <w:bCs/>
+        </w:rPr>
+        <w:t>dataset</w:t>
+      </w:r>
+      <w:r>
+        <w:t xml:space="preserve"> given shows a total of 31 variables, and 123683 entries</w:t>
+      </w:r>
+      <w:r>
+        <w:t xml:space="preserve">, each entry corresponding to a </w:t>
+      </w:r>
+      <w:r>
+        <w:t>unique customer.</w:t>
+      </w:r>
+    </w:p>
+    <w:p>
+      <w:pPr>
+        <w:ind w:firstLine="360"/>
+        <w:jc w:val="both"/>
+      </w:pPr>
+      <w:r>
+        <w:t xml:space="preserve">The primary identifier in this dataset is the </w:t>
+      </w:r>
+      <w:proofErr w:type="spellStart"/>
+      <w:r>
+        <w:rPr>
+          <w:b/>
+          <w:bCs/>
+        </w:rPr>
+        <w:t>ID_Client</w:t>
+      </w:r>
+      <w:proofErr w:type="spellEnd"/>
+      <w:r>
+        <w:t xml:space="preserve"> variable. However, despite the dataset having 123683 entries, there are only 122803 unique values. Thus, I will consider this as the true dimension of the </w:t>
+      </w:r>
+      <w:r>
+        <w:t>dataset and</w:t>
+      </w:r>
+      <w:r>
+        <w:t xml:space="preserve"> eliminate all rows with empty or repeated </w:t>
+      </w:r>
+      <w:proofErr w:type="spellStart"/>
+      <w:r>
+        <w:t>ID_Client</w:t>
+      </w:r>
+      <w:proofErr w:type="spellEnd"/>
+      <w:r>
+        <w:t>.</w:t>
+      </w:r>
+    </w:p>
+    <w:p>
+      <w:pPr>
+        <w:ind w:firstLine="360"/>
+        <w:jc w:val="both"/>
+      </w:pPr>
+      <w:r>
+        <w:t xml:space="preserve">In the </w:t>
+      </w:r>
+      <w:r>
+        <w:rPr>
+          <w:b/>
+          <w:bCs/>
+        </w:rPr>
+        <w:t>latitude/longitude</w:t>
+      </w:r>
+      <w:r>
+        <w:t xml:space="preserve"> columns, we see two separate groups of points. However, one of these groups seems to be in the middle of the sea, so I will assume that this is an error, and treat these points as missing values, filled by imputation.</w:t>
+      </w:r>
+      <w:r>
+        <w:t xml:space="preserve"> </w:t>
+      </w:r>
+      <w:proofErr w:type="spellStart"/>
+      <w:r>
+        <w:rPr>
+          <w:b/>
+          <w:bCs/>
+        </w:rPr>
+        <w:t>ZIP_Code</w:t>
+      </w:r>
+      <w:proofErr w:type="spellEnd"/>
+      <w:r>
+        <w:t xml:space="preserve"> also relates to location, but seeing as it only has a few unique values, adding very little information to the model. For this </w:t>
+      </w:r>
+      <w:proofErr w:type="gramStart"/>
+      <w:r>
+        <w:t>reason</w:t>
+      </w:r>
+      <w:proofErr w:type="gramEnd"/>
+      <w:r>
+        <w:t xml:space="preserve"> I will keep the latitude and longitude variables only.</w:t>
+      </w:r>
+    </w:p>
+    <w:p>
+      <w:pPr>
+        <w:ind w:firstLine="360"/>
+        <w:jc w:val="center"/>
+      </w:pPr>
+      <w:r>
+        <w:rPr>
+          <w:noProof/>
+        </w:rPr>
+        <w:drawing>
+          <wp:inline distT="0" distB="0" distL="0" distR="0" wp14:anchorId="396E0B1F" wp14:editId="2B50BAC2">
+            <wp:extent cx="3041650" cy="2117688"/>
+            <wp:effectExtent l="0" t="0" r="6350" b="0"/>
+            <wp:docPr id="1118990690" name="Picture 1" descr="A map of the world with blue dots&#10;&#10;AI-generated content may be incorrect."/>
+            <wp:cNvGraphicFramePr>
+              <a:graphicFrameLocks xmlns:a="http://schemas.openxmlformats.org/drawingml/2006/main" noChangeAspect="1"/>
+            </wp:cNvGraphicFramePr>
+            <a:graphic xmlns:a="http://schemas.openxmlformats.org/drawingml/2006/main">
+              <a:graphicData uri="http://schemas.openxmlformats.org/drawingml/2006/picture">
+                <pic:pic xmlns:pic="http://schemas.openxmlformats.org/drawingml/2006/picture">
+                  <pic:nvPicPr>
+                    <pic:cNvPr id="1118990690" name="Picture 1" descr="A map of the world with blue dots&#10;&#10;AI-generated content may be incorrect."/>
+                    <pic:cNvPicPr/>
+                  </pic:nvPicPr>
+                  <pic:blipFill>
+                    <a:blip r:embed="rId5"/>
+                    <a:stretch>
+                      <a:fillRect/>
+                    </a:stretch>
+                  </pic:blipFill>
+                  <pic:spPr>
+                    <a:xfrm>
+                      <a:off x="0" y="0"/>
+                      <a:ext cx="3050842" cy="2124088"/>
+                    </a:xfrm>
+                    <a:prstGeom prst="rect">
+                      <a:avLst/>
+                    </a:prstGeom>
+                  </pic:spPr>
+                </pic:pic>
+              </a:graphicData>
+            </a:graphic>
+          </wp:inline>
+        </w:drawing>
+      </w:r>
+    </w:p>
+    <w:p>
+      <w:pPr>
+        <w:ind w:firstLine="360"/>
+        <w:jc w:val="center"/>
+        <w:rPr>
+          <w:sz w:val="20"/>
+          <w:szCs w:val="20"/>
+        </w:rPr>
+      </w:pPr>
+      <w:r>
+        <w:rPr>
+          <w:sz w:val="20"/>
+          <w:szCs w:val="20"/>
+        </w:rPr>
+        <w:t>Fig. 1: Map visualization of Latitude and Longitude</w:t>
+      </w:r>
+    </w:p>
+    <w:p>
+      <w:pPr>
         <w:ind w:firstLine="720"/>
-      </w:pPr>
-      <w:r>
-        <w:t>This dataset requires thorough preprocessing before being able to be used in modelling. As such, for each of the variables, the following processes must be completed.</w:t>
+        <w:jc w:val="both"/>
+      </w:pPr>
+      <w:r>
+        <w:t xml:space="preserve">In the </w:t>
+      </w:r>
+      <w:r>
+        <w:rPr>
+          <w:b/>
+          <w:bCs/>
+        </w:rPr>
+        <w:t>Gender</w:t>
+      </w:r>
+      <w:r>
+        <w:t xml:space="preserve"> column, there are 7 unique values, which could be easily corrected though normalizing all to “male” or “female”. However, this column has 65% of values missing. Imputation could be a possible solution, but this column seems to add very little information to the model, so I will be removing it instead.</w:t>
+      </w:r>
+    </w:p>
+    <w:p>
+      <w:pPr>
+        <w:ind w:firstLine="720"/>
+        <w:jc w:val="both"/>
+      </w:pPr>
+      <w:r>
+        <w:lastRenderedPageBreak/>
+        <w:t xml:space="preserve">In </w:t>
+      </w:r>
+      <w:r>
+        <w:rPr>
+          <w:b/>
+          <w:bCs/>
+        </w:rPr>
+        <w:t>Education</w:t>
+      </w:r>
+      <w:r>
+        <w:t>, although this is currently displayed as a categorical variable of different degrees, the most efficient option for proper interpretation by the model would be “Years of education” instead. I will create this column, assuming “degree” refers to a bachelor’s degree, and that missing values are at least the minimum required education of high school.</w:t>
+      </w:r>
+    </w:p>
+    <w:p>
+      <w:pPr>
+        <w:ind w:firstLine="360"/>
+        <w:jc w:val="both"/>
+      </w:pPr>
+      <w:r>
+        <w:t xml:space="preserve">There are a significant number of negative values in the </w:t>
+      </w:r>
+      <w:r>
+        <w:rPr>
+          <w:b/>
+          <w:bCs/>
+        </w:rPr>
+        <w:t>item category columns</w:t>
+      </w:r>
+      <w:r>
+        <w:t>. For this, I present the following possible explanations:</w:t>
+      </w:r>
+    </w:p>
+    <w:p>
+      <w:pPr>
+        <w:pStyle w:val="ListParagraph"/>
+        <w:numPr>
+          <w:ilvl w:val="0"/>
+          <w:numId w:val="2"/>
+        </w:numPr>
+        <w:jc w:val="both"/>
+      </w:pPr>
+      <w:r>
+        <w:t>The store may be selling these categories at a loss.</w:t>
+      </w:r>
+    </w:p>
+    <w:p>
+      <w:pPr>
+        <w:pStyle w:val="ListParagraph"/>
+        <w:numPr>
+          <w:ilvl w:val="0"/>
+          <w:numId w:val="2"/>
+        </w:numPr>
+        <w:jc w:val="both"/>
+      </w:pPr>
+      <w:r>
+        <w:t>The customers are returning a certain amount of the items bought.</w:t>
+      </w:r>
+    </w:p>
+    <w:p>
+      <w:pPr>
+        <w:pStyle w:val="ListParagraph"/>
+        <w:numPr>
+          <w:ilvl w:val="0"/>
+          <w:numId w:val="2"/>
+        </w:numPr>
+        <w:jc w:val="both"/>
+      </w:pPr>
+      <w:r>
+        <w:t>There has been an error in data processing.</w:t>
+      </w:r>
+    </w:p>
+    <w:p>
+      <w:pPr>
+        <w:jc w:val="both"/>
+      </w:pPr>
+      <w:r>
+        <w:t>For this case study, I will assume the 1</w:t>
+      </w:r>
+      <w:r>
+        <w:rPr>
+          <w:vertAlign w:val="superscript"/>
+        </w:rPr>
+        <w:t>st</w:t>
+      </w:r>
+      <w:r>
+        <w:t xml:space="preserve"> option to be true, and leave these values as is.</w:t>
+      </w:r>
+    </w:p>
+    <w:p>
+      <w:pPr>
+        <w:ind w:firstLine="720"/>
+        <w:jc w:val="both"/>
+      </w:pPr>
+      <w:r>
+        <w:t xml:space="preserve">Considering </w:t>
+      </w:r>
+      <w:proofErr w:type="gramStart"/>
+      <w:r>
+        <w:t>all of</w:t>
+      </w:r>
+      <w:proofErr w:type="gramEnd"/>
+      <w:r>
+        <w:t xml:space="preserve"> the above, t</w:t>
+      </w:r>
+      <w:r>
+        <w:t>his dataset requires thorough preprocessing before being able to be used in modelling. As such, for each of the variables, the following processes must be completed.</w:t>
       </w:r>
     </w:p>
     <w:tbl>
@@ -282,7 +613,7 @@
               <w:cnfStyle w:val="000000000000" w:firstRow="0" w:lastRow="0" w:firstColumn="0" w:lastColumn="0" w:oddVBand="0" w:evenVBand="0" w:oddHBand="0" w:evenHBand="0" w:firstRowFirstColumn="0" w:firstRowLastColumn="0" w:lastRowFirstColumn="0" w:lastRowLastColumn="0"/>
             </w:pPr>
             <w:r>
-              <w:t>No preprocessing needed</w:t>
+              <w:t>Removing the column (No added information)</w:t>
             </w:r>
           </w:p>
         </w:tc>
@@ -364,7 +695,7 @@
               <w:cnfStyle w:val="000000000000" w:firstRow="0" w:lastRow="0" w:firstColumn="0" w:lastColumn="0" w:oddVBand="0" w:evenVBand="0" w:oddHBand="0" w:evenHBand="0" w:firstRowFirstColumn="0" w:firstRowLastColumn="0" w:lastRowFirstColumn="0" w:lastRowLastColumn="0"/>
             </w:pPr>
             <w:r>
-              <w:t>No preprocessing needed</w:t>
+              <w:t>Removing and imputing outliers</w:t>
             </w:r>
           </w:p>
         </w:tc>
@@ -401,7 +732,7 @@
               <w:cnfStyle w:val="000000100000" w:firstRow="0" w:lastRow="0" w:firstColumn="0" w:lastColumn="0" w:oddVBand="0" w:evenVBand="0" w:oddHBand="1" w:evenHBand="0" w:firstRowFirstColumn="0" w:firstRowLastColumn="0" w:lastRowFirstColumn="0" w:lastRowLastColumn="0"/>
             </w:pPr>
             <w:r>
-              <w:t>No preprocessing needed</w:t>
+              <w:t>Removing and imputing outliers</w:t>
             </w:r>
           </w:p>
         </w:tc>
@@ -778,6 +1109,7 @@
                 <w:b/>
                 <w:bCs/>
               </w:rPr>
+              <w:lastRenderedPageBreak/>
               <w:t>Promotional_percentage</w:t>
             </w:r>
             <w:proofErr w:type="spellEnd"/>
@@ -995,7 +1327,6 @@
                 <w:b/>
                 <w:bCs/>
               </w:rPr>
-              <w:lastRenderedPageBreak/>
               <w:t xml:space="preserve">Bread </w:t>
             </w:r>
           </w:p>
@@ -1009,13 +1340,7 @@
               <w:cnfStyle w:val="000000100000" w:firstRow="0" w:lastRow="0" w:firstColumn="0" w:lastColumn="0" w:oddVBand="0" w:evenVBand="0" w:oddHBand="1" w:evenHBand="0" w:firstRowFirstColumn="0" w:firstRowLastColumn="0" w:lastRowFirstColumn="0" w:lastRowLastColumn="0"/>
             </w:pPr>
             <w:r>
-              <w:t>S</w:t>
-            </w:r>
-            <w:r>
-              <w:t>caling</w:t>
-            </w:r>
-            <w:r>
-              <w:t xml:space="preserve"> only</w:t>
+              <w:t>Scaling only</w:t>
             </w:r>
           </w:p>
         </w:tc>
@@ -1343,60 +1668,51 @@
     <w:p/>
     <w:p>
       <w:pPr>
-        <w:ind w:firstLine="360"/>
-      </w:pPr>
-      <w:r>
-        <w:t>There are a significant number of negative values in the item category columns. For this, I present the following possible explanations:</w:t>
+        <w:rPr>
+          <w:b/>
+          <w:bCs/>
+        </w:rPr>
+      </w:pPr>
+      <w:r>
+        <w:rPr>
+          <w:b/>
+          <w:bCs/>
+        </w:rPr>
+        <w:t>2.2. Outliers and Scaling</w:t>
       </w:r>
     </w:p>
     <w:p>
-      <w:pPr>
-        <w:pStyle w:val="ListParagraph"/>
-        <w:numPr>
-          <w:ilvl w:val="0"/>
-          <w:numId w:val="2"/>
-        </w:numPr>
-      </w:pPr>
-      <w:r>
-        <w:t>The store may be selling these categories at a loss.</w:t>
-      </w:r>
-    </w:p>
-    <w:p>
-      <w:pPr>
-        <w:pStyle w:val="ListParagraph"/>
-        <w:numPr>
-          <w:ilvl w:val="0"/>
-          <w:numId w:val="2"/>
-        </w:numPr>
-      </w:pPr>
-      <w:r>
-        <w:t>The customers are returning a certain amount of the items bought.</w:t>
-      </w:r>
-    </w:p>
-    <w:p>
-      <w:pPr>
-        <w:pStyle w:val="ListParagraph"/>
-        <w:numPr>
-          <w:ilvl w:val="0"/>
-          <w:numId w:val="2"/>
-        </w:numPr>
-      </w:pPr>
-      <w:r>
-        <w:t>There has been an error in data processing.</w:t>
-      </w:r>
-    </w:p>
-    <w:p>
-      <w:r>
-        <w:t>For this case study, I will assume the 1</w:t>
-      </w:r>
+      <w:r>
+        <w:t xml:space="preserve">This dataset is mostly composed of numeric columns, but most of them have some </w:t>
+      </w:r>
+      <w:proofErr w:type="gramStart"/>
+      <w:r>
+        <w:t>amount of outlier</w:t>
+      </w:r>
+      <w:proofErr w:type="gramEnd"/>
+      <w:r>
+        <w:t xml:space="preserve"> values. These were identified through the created function </w:t>
+      </w:r>
+      <w:proofErr w:type="spellStart"/>
       <w:r>
         <w:rPr>
-          <w:vertAlign w:val="superscript"/>
+          <w:i/>
+          <w:iCs/>
         </w:rPr>
-        <w:t>st</w:t>
-      </w:r>
-      <w:r>
-        <w:t xml:space="preserve"> option to be true, and leave these values as is.</w:t>
+        <w:t>clean_</w:t>
+      </w:r>
+      <w:r>
+        <w:t>outliers</w:t>
+      </w:r>
+      <w:proofErr w:type="spellEnd"/>
+      <w:r>
+        <w:t xml:space="preserve">, </w:t>
+      </w:r>
+      <w:r>
+        <w:t>through</w:t>
+      </w:r>
+      <w:r>
+        <w:t xml:space="preserve"> which for each numeric variable, identifies the outlier values through </w:t>
       </w:r>
     </w:p>
     <w:p/>
@@ -1423,26 +1739,166 @@
       </w:r>
     </w:p>
     <w:p>
-      <w:r>
-        <w:t xml:space="preserve">For </w:t>
+      <w:pPr>
+        <w:ind w:firstLine="720"/>
+        <w:jc w:val="both"/>
+      </w:pPr>
+      <w:r>
+        <w:t xml:space="preserve">For this case study, the main priority is the creation of effective marketing strategies. For this, our priority in clustering is to create loyal groups wherein we can make sure that our marketing will be effective. With this context, the </w:t>
+      </w:r>
+      <w:r>
+        <w:t xml:space="preserve">main </w:t>
+      </w:r>
+      <w:r>
+        <w:t xml:space="preserve">clustering algorithm used in this project is DBSCAN, a density-based algorithm that groups points based on local point density and marks low-density points as noise. </w:t>
       </w:r>
     </w:p>
     <w:p>
-      <w:r>
-        <w:t xml:space="preserve">Algorithms used: K-Means, </w:t>
-      </w:r>
-      <w:r>
-        <w:t>Hierarchical Agglomerative</w:t>
-      </w:r>
-      <w:r>
-        <w:t>, HDBSCAN</w:t>
-      </w:r>
-      <w:r>
-        <w:t xml:space="preserve"> and</w:t>
-      </w:r>
-      <w:r>
-        <w:t xml:space="preserve"> SOM</w:t>
-      </w:r>
+      <w:pPr>
+        <w:ind w:firstLine="720"/>
+        <w:jc w:val="both"/>
+      </w:pPr>
+      <w:r>
+        <w:t xml:space="preserve">However, since every individual must belong to a cluster, DBSCAN is applied only in the purchase </w:t>
+      </w:r>
+      <w:proofErr w:type="spellStart"/>
+      <w:r>
+        <w:t>behaviour</w:t>
+      </w:r>
+      <w:proofErr w:type="spellEnd"/>
+      <w:r>
+        <w:t xml:space="preserve"> clustering solution. For the demographic variables, </w:t>
+      </w:r>
+      <w:proofErr w:type="spellStart"/>
+      <w:r>
+        <w:t>KMeans</w:t>
+      </w:r>
+      <w:proofErr w:type="spellEnd"/>
+      <w:r>
+        <w:t xml:space="preserve"> </w:t>
+      </w:r>
+      <w:r>
+        <w:t xml:space="preserve">and Agglomerative Clustering </w:t>
+      </w:r>
+      <w:r>
+        <w:t xml:space="preserve">will be </w:t>
+      </w:r>
+      <w:r>
+        <w:t>tested</w:t>
+      </w:r>
+      <w:r>
+        <w:t xml:space="preserve"> instead, for </w:t>
+      </w:r>
+      <w:r>
+        <w:t>their</w:t>
+      </w:r>
+      <w:r>
+        <w:t xml:space="preserve"> simplicity and interpretability.</w:t>
+      </w:r>
+    </w:p>
+    <w:p>
+      <w:pPr>
+        <w:pStyle w:val="ListParagraph"/>
+        <w:numPr>
+          <w:ilvl w:val="1"/>
+          <w:numId w:val="2"/>
+        </w:numPr>
+        <w:jc w:val="both"/>
+        <w:rPr>
+          <w:b/>
+          <w:bCs/>
+        </w:rPr>
+      </w:pPr>
+      <w:r>
+        <w:rPr>
+          <w:b/>
+          <w:bCs/>
+        </w:rPr>
+        <w:lastRenderedPageBreak/>
+        <w:t xml:space="preserve">Demographic Clustering </w:t>
+      </w:r>
+      <w:r>
+        <w:rPr>
+          <w:b/>
+          <w:bCs/>
+        </w:rPr>
+        <w:t>–</w:t>
+      </w:r>
+      <w:r>
+        <w:rPr>
+          <w:b/>
+          <w:bCs/>
+        </w:rPr>
+        <w:t xml:space="preserve"> </w:t>
+      </w:r>
+      <w:proofErr w:type="spellStart"/>
+      <w:r>
+        <w:rPr>
+          <w:b/>
+          <w:bCs/>
+        </w:rPr>
+        <w:t>Kmeans</w:t>
+      </w:r>
+      <w:proofErr w:type="spellEnd"/>
+    </w:p>
+    <w:p>
+      <w:pPr>
+        <w:ind w:left="360"/>
+        <w:jc w:val="both"/>
+      </w:pPr>
+      <w:proofErr w:type="spellStart"/>
+      <w:r>
+        <w:t>asd</w:t>
+      </w:r>
+      <w:proofErr w:type="spellEnd"/>
+    </w:p>
+    <w:p>
+      <w:pPr>
+        <w:pStyle w:val="ListParagraph"/>
+        <w:numPr>
+          <w:ilvl w:val="1"/>
+          <w:numId w:val="2"/>
+        </w:numPr>
+        <w:jc w:val="both"/>
+        <w:rPr>
+          <w:b/>
+          <w:bCs/>
+        </w:rPr>
+      </w:pPr>
+      <w:r>
+        <w:rPr>
+          <w:b/>
+          <w:bCs/>
+        </w:rPr>
+        <w:t xml:space="preserve">Purchase </w:t>
+      </w:r>
+      <w:proofErr w:type="spellStart"/>
+      <w:r>
+        <w:rPr>
+          <w:b/>
+          <w:bCs/>
+        </w:rPr>
+        <w:t>Behaviour</w:t>
+      </w:r>
+      <w:proofErr w:type="spellEnd"/>
+      <w:r>
+        <w:rPr>
+          <w:b/>
+          <w:bCs/>
+        </w:rPr>
+        <w:t xml:space="preserve"> Clustering – DBSCAN</w:t>
+      </w:r>
+    </w:p>
+    <w:p>
+      <w:pPr>
+        <w:ind w:left="360"/>
+        <w:jc w:val="both"/>
+      </w:pPr>
+      <w:proofErr w:type="spellStart"/>
+      <w:r>
+        <w:t>asd</w:t>
+      </w:r>
+      <w:proofErr w:type="spellEnd"/>
     </w:p>
     <w:sectPr>
       <w:pgSz w:w="12240" w:h="15840"/>
@@ -1547,9 +2003,9 @@
   </w:abstractNum>
   <w:abstractNum w:abstractNumId="1" w15:restartNumberingAfterBreak="0">
     <w:nsid w:val="2FB872C3"/>
-    <w:multiLevelType w:val="hybridMultilevel"/>
-    <w:tmpl w:val="511033DC"/>
-    <w:lvl w:ilvl="0" w:tplc="0409000F">
+    <w:multiLevelType w:val="multilevel"/>
+    <w:tmpl w:val="172E98BC"/>
+    <w:lvl w:ilvl="0">
       <w:start w:val="1"/>
       <w:numFmt w:val="decimal"/>
       <w:lvlText w:val="%1."/>
@@ -1561,84 +2017,116 @@
         <w:rFonts w:hint="default"/>
       </w:rPr>
     </w:lvl>
-    <w:lvl w:ilvl="1" w:tplc="04090019" w:tentative="1">
-      <w:start w:val="1"/>
-      <w:numFmt w:val="lowerLetter"/>
-      <w:lvlText w:val="%2."/>
-      <w:lvlJc w:val="left"/>
-      <w:pPr>
-        <w:ind w:left="1440" w:hanging="360"/>
-      </w:pPr>
-    </w:lvl>
-    <w:lvl w:ilvl="2" w:tplc="0409001B" w:tentative="1">
-      <w:start w:val="1"/>
-      <w:numFmt w:val="lowerRoman"/>
-      <w:lvlText w:val="%3."/>
-      <w:lvlJc w:val="right"/>
-      <w:pPr>
-        <w:ind w:left="2160" w:hanging="180"/>
-      </w:pPr>
-    </w:lvl>
-    <w:lvl w:ilvl="3" w:tplc="0409000F" w:tentative="1">
+    <w:lvl w:ilvl="1">
       <w:start w:val="1"/>
       <w:numFmt w:val="decimal"/>
-      <w:lvlText w:val="%4."/>
+      <w:isLgl/>
+      <w:lvlText w:val="%1.%2."/>
       <w:lvlJc w:val="left"/>
       <w:pPr>
-        <w:ind w:left="2880" w:hanging="360"/>
-      </w:pPr>
+        <w:ind w:left="1080" w:hanging="720"/>
+      </w:pPr>
+      <w:rPr>
+        <w:rFonts w:hint="default"/>
+      </w:rPr>
     </w:lvl>
-    <w:lvl w:ilvl="4" w:tplc="04090019" w:tentative="1">
-      <w:start w:val="1"/>
-      <w:numFmt w:val="lowerLetter"/>
-      <w:lvlText w:val="%5."/>
-      <w:lvlJc w:val="left"/>
-      <w:pPr>
-        <w:ind w:left="3600" w:hanging="360"/>
-      </w:pPr>
-    </w:lvl>
-    <w:lvl w:ilvl="5" w:tplc="0409001B" w:tentative="1">
-      <w:start w:val="1"/>
-      <w:numFmt w:val="lowerRoman"/>
-      <w:lvlText w:val="%6."/>
-      <w:lvlJc w:val="right"/>
-      <w:pPr>
-        <w:ind w:left="4320" w:hanging="180"/>
-      </w:pPr>
-    </w:lvl>
-    <w:lvl w:ilvl="6" w:tplc="0409000F" w:tentative="1">
+    <w:lvl w:ilvl="2">
       <w:start w:val="1"/>
       <w:numFmt w:val="decimal"/>
-      <w:lvlText w:val="%7."/>
+      <w:isLgl/>
+      <w:lvlText w:val="%1.%2.%3."/>
       <w:lvlJc w:val="left"/>
       <w:pPr>
-        <w:ind w:left="5040" w:hanging="360"/>
-      </w:pPr>
+        <w:ind w:left="1080" w:hanging="720"/>
+      </w:pPr>
+      <w:rPr>
+        <w:rFonts w:hint="default"/>
+      </w:rPr>
     </w:lvl>
-    <w:lvl w:ilvl="7" w:tplc="04090019" w:tentative="1">
+    <w:lvl w:ilvl="3">
       <w:start w:val="1"/>
-      <w:numFmt w:val="lowerLetter"/>
-      <w:lvlText w:val="%8."/>
+      <w:numFmt w:val="decimal"/>
+      <w:isLgl/>
+      <w:lvlText w:val="%1.%2.%3.%4."/>
       <w:lvlJc w:val="left"/>
       <w:pPr>
-        <w:ind w:left="5760" w:hanging="360"/>
-      </w:pPr>
+        <w:ind w:left="1440" w:hanging="1080"/>
+      </w:pPr>
+      <w:rPr>
+        <w:rFonts w:hint="default"/>
+      </w:rPr>
     </w:lvl>
-    <w:lvl w:ilvl="8" w:tplc="0409001B" w:tentative="1">
+    <w:lvl w:ilvl="4">
       <w:start w:val="1"/>
-      <w:numFmt w:val="lowerRoman"/>
-      <w:lvlText w:val="%9."/>
-      <w:lvlJc w:val="right"/>
-      <w:pPr>
-        <w:ind w:left="6480" w:hanging="180"/>
-      </w:pPr>
+      <w:numFmt w:val="decimal"/>
+      <w:isLgl/>
+      <w:lvlText w:val="%1.%2.%3.%4.%5."/>
+      <w:lvlJc w:val="left"/>
+      <w:pPr>
+        <w:ind w:left="1440" w:hanging="1080"/>
+      </w:pPr>
+      <w:rPr>
+        <w:rFonts w:hint="default"/>
+      </w:rPr>
+    </w:lvl>
+    <w:lvl w:ilvl="5">
+      <w:start w:val="1"/>
+      <w:numFmt w:val="decimal"/>
+      <w:isLgl/>
+      <w:lvlText w:val="%1.%2.%3.%4.%5.%6."/>
+      <w:lvlJc w:val="left"/>
+      <w:pPr>
+        <w:ind w:left="1800" w:hanging="1440"/>
+      </w:pPr>
+      <w:rPr>
+        <w:rFonts w:hint="default"/>
+      </w:rPr>
+    </w:lvl>
+    <w:lvl w:ilvl="6">
+      <w:start w:val="1"/>
+      <w:numFmt w:val="decimal"/>
+      <w:isLgl/>
+      <w:lvlText w:val="%1.%2.%3.%4.%5.%6.%7."/>
+      <w:lvlJc w:val="left"/>
+      <w:pPr>
+        <w:ind w:left="1800" w:hanging="1440"/>
+      </w:pPr>
+      <w:rPr>
+        <w:rFonts w:hint="default"/>
+      </w:rPr>
+    </w:lvl>
+    <w:lvl w:ilvl="7">
+      <w:start w:val="1"/>
+      <w:numFmt w:val="decimal"/>
+      <w:isLgl/>
+      <w:lvlText w:val="%1.%2.%3.%4.%5.%6.%7.%8."/>
+      <w:lvlJc w:val="left"/>
+      <w:pPr>
+        <w:ind w:left="2160" w:hanging="1800"/>
+      </w:pPr>
+      <w:rPr>
+        <w:rFonts w:hint="default"/>
+      </w:rPr>
+    </w:lvl>
+    <w:lvl w:ilvl="8">
+      <w:start w:val="1"/>
+      <w:numFmt w:val="decimal"/>
+      <w:isLgl/>
+      <w:lvlText w:val="%1.%2.%3.%4.%5.%6.%7.%8.%9."/>
+      <w:lvlJc w:val="left"/>
+      <w:pPr>
+        <w:ind w:left="2520" w:hanging="2160"/>
+      </w:pPr>
+      <w:rPr>
+        <w:rFonts w:hint="default"/>
+      </w:rPr>
     </w:lvl>
   </w:abstractNum>
   <w:abstractNum w:abstractNumId="2" w15:restartNumberingAfterBreak="0">
     <w:nsid w:val="68433276"/>
-    <w:multiLevelType w:val="hybridMultilevel"/>
-    <w:tmpl w:val="710C46C0"/>
-    <w:lvl w:ilvl="0" w:tplc="8CBED4B2">
+    <w:multiLevelType w:val="multilevel"/>
+    <w:tmpl w:val="9502D518"/>
+    <w:lvl w:ilvl="0">
       <w:start w:val="1"/>
       <w:numFmt w:val="decimal"/>
       <w:lvlText w:val="%1."/>
@@ -1652,77 +2140,109 @@
         <w:bCs/>
       </w:rPr>
     </w:lvl>
-    <w:lvl w:ilvl="1" w:tplc="04090019" w:tentative="1">
-      <w:start w:val="1"/>
-      <w:numFmt w:val="lowerLetter"/>
-      <w:lvlText w:val="%2."/>
-      <w:lvlJc w:val="left"/>
-      <w:pPr>
-        <w:ind w:left="1080" w:hanging="360"/>
-      </w:pPr>
-    </w:lvl>
-    <w:lvl w:ilvl="2" w:tplc="0409001B" w:tentative="1">
-      <w:start w:val="1"/>
-      <w:numFmt w:val="lowerRoman"/>
-      <w:lvlText w:val="%3."/>
-      <w:lvlJc w:val="right"/>
-      <w:pPr>
-        <w:ind w:left="1800" w:hanging="180"/>
-      </w:pPr>
-    </w:lvl>
-    <w:lvl w:ilvl="3" w:tplc="0409000F" w:tentative="1">
+    <w:lvl w:ilvl="1">
       <w:start w:val="1"/>
       <w:numFmt w:val="decimal"/>
-      <w:lvlText w:val="%4."/>
+      <w:isLgl/>
+      <w:lvlText w:val="%1.%2."/>
       <w:lvlJc w:val="left"/>
       <w:pPr>
-        <w:ind w:left="2520" w:hanging="360"/>
-      </w:pPr>
+        <w:ind w:left="720" w:hanging="720"/>
+      </w:pPr>
+      <w:rPr>
+        <w:rFonts w:hint="default"/>
+      </w:rPr>
     </w:lvl>
-    <w:lvl w:ilvl="4" w:tplc="04090019" w:tentative="1">
-      <w:start w:val="1"/>
-      <w:numFmt w:val="lowerLetter"/>
-      <w:lvlText w:val="%5."/>
-      <w:lvlJc w:val="left"/>
-      <w:pPr>
-        <w:ind w:left="3240" w:hanging="360"/>
-      </w:pPr>
-    </w:lvl>
-    <w:lvl w:ilvl="5" w:tplc="0409001B" w:tentative="1">
-      <w:start w:val="1"/>
-      <w:numFmt w:val="lowerRoman"/>
-      <w:lvlText w:val="%6."/>
-      <w:lvlJc w:val="right"/>
-      <w:pPr>
-        <w:ind w:left="3960" w:hanging="180"/>
-      </w:pPr>
-    </w:lvl>
-    <w:lvl w:ilvl="6" w:tplc="0409000F" w:tentative="1">
+    <w:lvl w:ilvl="2">
       <w:start w:val="1"/>
       <w:numFmt w:val="decimal"/>
-      <w:lvlText w:val="%7."/>
+      <w:isLgl/>
+      <w:lvlText w:val="%1.%2.%3."/>
       <w:lvlJc w:val="left"/>
       <w:pPr>
-        <w:ind w:left="4680" w:hanging="360"/>
-      </w:pPr>
+        <w:ind w:left="720" w:hanging="720"/>
+      </w:pPr>
+      <w:rPr>
+        <w:rFonts w:hint="default"/>
+      </w:rPr>
     </w:lvl>
-    <w:lvl w:ilvl="7" w:tplc="04090019" w:tentative="1">
+    <w:lvl w:ilvl="3">
       <w:start w:val="1"/>
-      <w:numFmt w:val="lowerLetter"/>
-      <w:lvlText w:val="%8."/>
+      <w:numFmt w:val="decimal"/>
+      <w:isLgl/>
+      <w:lvlText w:val="%1.%2.%3.%4."/>
       <w:lvlJc w:val="left"/>
       <w:pPr>
-        <w:ind w:left="5400" w:hanging="360"/>
-      </w:pPr>
+        <w:ind w:left="1080" w:hanging="1080"/>
+      </w:pPr>
+      <w:rPr>
+        <w:rFonts w:hint="default"/>
+      </w:rPr>
     </w:lvl>
-    <w:lvl w:ilvl="8" w:tplc="0409001B" w:tentative="1">
+    <w:lvl w:ilvl="4">
       <w:start w:val="1"/>
-      <w:numFmt w:val="lowerRoman"/>
-      <w:lvlText w:val="%9."/>
-      <w:lvlJc w:val="right"/>
-      <w:pPr>
-        <w:ind w:left="6120" w:hanging="180"/>
-      </w:pPr>
+      <w:numFmt w:val="decimal"/>
+      <w:isLgl/>
+      <w:lvlText w:val="%1.%2.%3.%4.%5."/>
+      <w:lvlJc w:val="left"/>
+      <w:pPr>
+        <w:ind w:left="1080" w:hanging="1080"/>
+      </w:pPr>
+      <w:rPr>
+        <w:rFonts w:hint="default"/>
+      </w:rPr>
+    </w:lvl>
+    <w:lvl w:ilvl="5">
+      <w:start w:val="1"/>
+      <w:numFmt w:val="decimal"/>
+      <w:isLgl/>
+      <w:lvlText w:val="%1.%2.%3.%4.%5.%6."/>
+      <w:lvlJc w:val="left"/>
+      <w:pPr>
+        <w:ind w:left="1440" w:hanging="1440"/>
+      </w:pPr>
+      <w:rPr>
+        <w:rFonts w:hint="default"/>
+      </w:rPr>
+    </w:lvl>
+    <w:lvl w:ilvl="6">
+      <w:start w:val="1"/>
+      <w:numFmt w:val="decimal"/>
+      <w:isLgl/>
+      <w:lvlText w:val="%1.%2.%3.%4.%5.%6.%7."/>
+      <w:lvlJc w:val="left"/>
+      <w:pPr>
+        <w:ind w:left="1440" w:hanging="1440"/>
+      </w:pPr>
+      <w:rPr>
+        <w:rFonts w:hint="default"/>
+      </w:rPr>
+    </w:lvl>
+    <w:lvl w:ilvl="7">
+      <w:start w:val="1"/>
+      <w:numFmt w:val="decimal"/>
+      <w:isLgl/>
+      <w:lvlText w:val="%1.%2.%3.%4.%5.%6.%7.%8."/>
+      <w:lvlJc w:val="left"/>
+      <w:pPr>
+        <w:ind w:left="1800" w:hanging="1800"/>
+      </w:pPr>
+      <w:rPr>
+        <w:rFonts w:hint="default"/>
+      </w:rPr>
+    </w:lvl>
+    <w:lvl w:ilvl="8">
+      <w:start w:val="1"/>
+      <w:numFmt w:val="decimal"/>
+      <w:isLgl/>
+      <w:lvlText w:val="%1.%2.%3.%4.%5.%6.%7.%8.%9."/>
+      <w:lvlJc w:val="left"/>
+      <w:pPr>
+        <w:ind w:left="1800" w:hanging="1800"/>
+      </w:pPr>
+      <w:rPr>
+        <w:rFonts w:hint="default"/>
+      </w:rPr>
     </w:lvl>
   </w:abstractNum>
   <w:num w:numId="1" w16cid:durableId="1544438684">
@@ -2340,6 +2860,7 @@
   <w:style w:type="character" w:default="1" w:styleId="DefaultParagraphFont">
     <w:name w:val="Default Paragraph Font"/>
     <w:uiPriority w:val="1"/>
+    <w:semiHidden/>
     <w:unhideWhenUsed/>
   </w:style>
   <w:style w:type="table" w:default="1" w:styleId="TableNormal">

</xml_diff>